<commit_message>
Implemented Bronze layer with raw ingestion and audit framework
</commit_message>
<xml_diff>
--- a/docs/ListenBrainz_Design_Document.docx
+++ b/docs/ListenBrainz_Design_Document.docx
@@ -80,7 +80,15 @@
     </w:p>
     <w:p>
       <w:r>
-        <w:t xml:space="preserve">The purpose of this document is to explain the architectural decisions, assumptions, dimensional model, ETL design and implementation strategy used to build a data warehouse for the ListenBrainz dataset using </w:t>
+        <w:t xml:space="preserve">The purpose of this document is to explain the architectural decisions, assumptions, dimensional model, ETL design and implementation strategy used to build a data warehouse for the </w:t>
+      </w:r>
+      <w:proofErr w:type="spellStart"/>
+      <w:r>
+        <w:t>ListenBrainz</w:t>
+      </w:r>
+      <w:proofErr w:type="spellEnd"/>
+      <w:r>
+        <w:t xml:space="preserve"> dataset using </w:t>
       </w:r>
       <w:proofErr w:type="spellStart"/>
       <w:r>
@@ -118,91 +126,205 @@
         </w:numPr>
       </w:pPr>
       <w:r>
-        <w:t>Objective</w:t>
+        <w:t>O</w:t>
       </w:r>
       <w:r>
-        <w:br/>
-        <w:t>2. Scope</w:t>
+        <w:t>bjective</w:t>
+      </w:r>
+    </w:p>
+    <w:p>
+      <w:pPr>
+        <w:pStyle w:val="ListParagraph"/>
+        <w:numPr>
+          <w:ilvl w:val="0"/>
+          <w:numId w:val="10"/>
+        </w:numPr>
+      </w:pPr>
+      <w:r>
+        <w:t>Scope</w:t>
+      </w:r>
+    </w:p>
+    <w:p>
+      <w:pPr>
+        <w:pStyle w:val="ListParagraph"/>
+        <w:numPr>
+          <w:ilvl w:val="0"/>
+          <w:numId w:val="10"/>
+        </w:numPr>
+      </w:pPr>
+      <w:r>
+        <w:t>Source System Overview</w:t>
+      </w:r>
+    </w:p>
+    <w:p>
+      <w:pPr>
+        <w:pStyle w:val="ListParagraph"/>
+        <w:numPr>
+          <w:ilvl w:val="0"/>
+          <w:numId w:val="10"/>
+        </w:numPr>
+      </w:pPr>
+      <w:r>
+        <w:t xml:space="preserve">Source </w:t>
       </w:r>
       <w:r>
-        <w:br/>
-        <w:t xml:space="preserve">3. </w:t>
+        <w:t>Data Analysis</w:t>
       </w:r>
+    </w:p>
+    <w:p>
+      <w:pPr>
+        <w:pStyle w:val="ListParagraph"/>
+        <w:numPr>
+          <w:ilvl w:val="0"/>
+          <w:numId w:val="10"/>
+        </w:numPr>
+      </w:pPr>
       <w:r>
-        <w:t>Overall Solution Architectur</w:t>
+        <w:t>Assumptions</w:t>
       </w:r>
+    </w:p>
+    <w:p>
+      <w:pPr>
+        <w:pStyle w:val="ListParagraph"/>
+        <w:numPr>
+          <w:ilvl w:val="0"/>
+          <w:numId w:val="10"/>
+        </w:numPr>
+      </w:pPr>
       <w:r>
-        <w:t>e</w:t>
+        <w:t>Architecture</w:t>
       </w:r>
+    </w:p>
+    <w:p>
+      <w:pPr>
+        <w:pStyle w:val="ListParagraph"/>
+        <w:numPr>
+          <w:ilvl w:val="0"/>
+          <w:numId w:val="10"/>
+        </w:numPr>
+      </w:pPr>
       <w:r>
-        <w:br/>
+        <w:t>Bronze Layer</w:t>
       </w:r>
+    </w:p>
+    <w:p>
+      <w:pPr>
+        <w:pStyle w:val="ListParagraph"/>
+        <w:numPr>
+          <w:ilvl w:val="0"/>
+          <w:numId w:val="10"/>
+        </w:numPr>
+      </w:pPr>
       <w:r>
-        <w:t>4</w:t>
+        <w:t>Silver Layer</w:t>
       </w:r>
+    </w:p>
+    <w:p>
+      <w:pPr>
+        <w:pStyle w:val="ListParagraph"/>
+        <w:numPr>
+          <w:ilvl w:val="0"/>
+          <w:numId w:val="10"/>
+        </w:numPr>
+      </w:pPr>
       <w:r>
-        <w:t>. Source System Overview</w:t>
+        <w:t>Gold Layer</w:t>
       </w:r>
+    </w:p>
+    <w:p>
+      <w:pPr>
+        <w:pStyle w:val="ListParagraph"/>
+        <w:numPr>
+          <w:ilvl w:val="0"/>
+          <w:numId w:val="10"/>
+        </w:numPr>
+      </w:pPr>
       <w:r>
-        <w:br/>
+        <w:t>Dimensional Model</w:t>
       </w:r>
+    </w:p>
+    <w:p>
+      <w:pPr>
+        <w:pStyle w:val="ListParagraph"/>
+        <w:numPr>
+          <w:ilvl w:val="0"/>
+          <w:numId w:val="10"/>
+        </w:numPr>
+      </w:pPr>
       <w:r>
-        <w:t>5</w:t>
+        <w:t>Fact Design</w:t>
       </w:r>
+    </w:p>
+    <w:p>
+      <w:pPr>
+        <w:pStyle w:val="ListParagraph"/>
+        <w:numPr>
+          <w:ilvl w:val="0"/>
+          <w:numId w:val="10"/>
+        </w:numPr>
+      </w:pPr>
       <w:r>
-        <w:t>. Source Data Analysis</w:t>
+        <w:t>Key Strategy</w:t>
       </w:r>
+    </w:p>
+    <w:p>
+      <w:pPr>
+        <w:pStyle w:val="ListParagraph"/>
+        <w:numPr>
+          <w:ilvl w:val="0"/>
+          <w:numId w:val="10"/>
+        </w:numPr>
+      </w:pPr>
       <w:r>
-        <w:br/>
-        <w:t>5. Assumptions</w:t>
+        <w:t>ETL Flow</w:t>
       </w:r>
+    </w:p>
+    <w:p>
+      <w:pPr>
+        <w:pStyle w:val="ListParagraph"/>
+        <w:numPr>
+          <w:ilvl w:val="0"/>
+          <w:numId w:val="10"/>
+        </w:numPr>
+      </w:pPr>
       <w:r>
-        <w:br/>
-        <w:t>6. Architecture</w:t>
+        <w:t>Data Quality</w:t>
       </w:r>
+    </w:p>
+    <w:p>
+      <w:pPr>
+        <w:pStyle w:val="ListParagraph"/>
+        <w:numPr>
+          <w:ilvl w:val="0"/>
+          <w:numId w:val="10"/>
+        </w:numPr>
+      </w:pPr>
       <w:r>
-        <w:br/>
-        <w:t>7. Bronze Layer</w:t>
+        <w:t>Performance Considerations</w:t>
       </w:r>
+    </w:p>
+    <w:p>
+      <w:pPr>
+        <w:pStyle w:val="ListParagraph"/>
+        <w:numPr>
+          <w:ilvl w:val="0"/>
+          <w:numId w:val="10"/>
+        </w:numPr>
+      </w:pPr>
       <w:r>
-        <w:br/>
-        <w:t>8. Silver Layer</w:t>
+        <w:t>Future Enhancements</w:t>
       </w:r>
+    </w:p>
+    <w:p>
+      <w:pPr>
+        <w:pStyle w:val="ListParagraph"/>
+        <w:numPr>
+          <w:ilvl w:val="0"/>
+          <w:numId w:val="10"/>
+        </w:numPr>
+      </w:pPr>
       <w:r>
-        <w:br/>
-        <w:t>9. Gold Layer</w:t>
-      </w:r>
-      <w:r>
-        <w:br/>
-        <w:t>10. Dimensional Model</w:t>
-      </w:r>
-      <w:r>
-        <w:br/>
-        <w:t>11. Fact Design</w:t>
-      </w:r>
-      <w:r>
-        <w:br/>
-        <w:t>12. Key Strategy</w:t>
-      </w:r>
-      <w:r>
-        <w:br/>
-        <w:t>13. ETL Flow</w:t>
-      </w:r>
-      <w:r>
-        <w:br/>
-        <w:t>14. Data Quality</w:t>
-      </w:r>
-      <w:r>
-        <w:br/>
-        <w:t>15. Performance Considerations</w:t>
-      </w:r>
-      <w:r>
-        <w:br/>
-        <w:t>16. Future Enhancements</w:t>
-      </w:r>
-      <w:r>
-        <w:br/>
-        <w:t>17. Conclusion</w:t>
+        <w:t>Conclusion</w:t>
       </w:r>
     </w:p>
     <w:p/>
@@ -216,6 +338,7 @@
     <w:p/>
     <w:p/>
     <w:p/>
+    <w:p/>
     <w:p>
       <w:pPr>
         <w:pStyle w:val="Heading1"/>
@@ -227,7 +350,15 @@
     </w:p>
     <w:p>
       <w:r>
-        <w:t>Design a scalable analytical warehouse that ingests raw ListenBrainz events, preserves source fidelity, transforms the data into reusable business entities, and exposes analytical datasets suitable for reporting.</w:t>
+        <w:t xml:space="preserve">The objective of this project is to design a scalable analytical data warehouse for the </w:t>
+      </w:r>
+      <w:proofErr w:type="spellStart"/>
+      <w:r>
+        <w:t>ListenBrainz</w:t>
+      </w:r>
+      <w:proofErr w:type="spellEnd"/>
+      <w:r>
+        <w:t xml:space="preserve"> dataset. The solution should ingest raw listening events, preserve the original source data, transform it into reusable business entities, and provide a structured data model that supports analytical reporting and business queries.</w:t>
       </w:r>
     </w:p>
     <w:p>
@@ -239,28 +370,138 @@
       </w:r>
     </w:p>
     <w:p>
+      <w:pPr>
+        <w:rPr>
+          <w:lang w:val="en-IN"/>
+        </w:rPr>
+      </w:pPr>
       <w:r>
-        <w:t>- Ingest NDJSON files</w:t>
+        <w:rPr>
+          <w:lang w:val="en-IN"/>
+        </w:rPr>
+        <w:t>The scope of this solution includes:</w:t>
       </w:r>
+    </w:p>
+    <w:p>
+      <w:pPr>
+        <w:numPr>
+          <w:ilvl w:val="0"/>
+          <w:numId w:val="11"/>
+        </w:numPr>
+        <w:spacing w:after="0" w:line="240" w:lineRule="auto"/>
+        <w:rPr>
+          <w:lang w:val="en-IN"/>
+        </w:rPr>
+      </w:pPr>
       <w:r>
-        <w:br/>
-        <w:t>- Store raw data in Bronze</w:t>
+        <w:rPr>
+          <w:lang w:val="en-IN"/>
+        </w:rPr>
+        <w:t xml:space="preserve">Ingesting NDJSON files into the data warehouse. </w:t>
       </w:r>
+    </w:p>
+    <w:p>
+      <w:pPr>
+        <w:numPr>
+          <w:ilvl w:val="0"/>
+          <w:numId w:val="11"/>
+        </w:numPr>
+        <w:spacing w:after="0" w:line="240" w:lineRule="auto"/>
+        <w:rPr>
+          <w:lang w:val="en-IN"/>
+        </w:rPr>
+      </w:pPr>
       <w:r>
-        <w:br/>
-        <w:t>- Parse and validate JSON</w:t>
+        <w:rPr>
+          <w:lang w:val="en-IN"/>
+        </w:rPr>
+        <w:t xml:space="preserve">Preserving the raw source data in the </w:t>
       </w:r>
+      <w:proofErr w:type="gramStart"/>
       <w:r>
-        <w:br/>
-        <w:t>- Build dimensions and fact tables</w:t>
+        <w:rPr>
+          <w:lang w:val="en-IN"/>
+        </w:rPr>
+        <w:t>Bronze</w:t>
       </w:r>
+      <w:proofErr w:type="gramEnd"/>
       <w:r>
-        <w:br/>
-        <w:t>- Support analytical SQL queries</w:t>
+        <w:rPr>
+          <w:lang w:val="en-IN"/>
+        </w:rPr>
+        <w:t xml:space="preserve"> layer. </w:t>
       </w:r>
+    </w:p>
+    <w:p>
+      <w:pPr>
+        <w:numPr>
+          <w:ilvl w:val="0"/>
+          <w:numId w:val="11"/>
+        </w:numPr>
+        <w:spacing w:after="0" w:line="240" w:lineRule="auto"/>
+        <w:rPr>
+          <w:lang w:val="en-IN"/>
+        </w:rPr>
+      </w:pPr>
       <w:r>
-        <w:br/>
-        <w:t>- Maintain auditability through load metadata</w:t>
+        <w:rPr>
+          <w:lang w:val="en-IN"/>
+        </w:rPr>
+        <w:t xml:space="preserve">Parsing and validating the JSON data. </w:t>
+      </w:r>
+    </w:p>
+    <w:p>
+      <w:pPr>
+        <w:numPr>
+          <w:ilvl w:val="0"/>
+          <w:numId w:val="11"/>
+        </w:numPr>
+        <w:spacing w:after="0" w:line="240" w:lineRule="auto"/>
+        <w:rPr>
+          <w:lang w:val="en-IN"/>
+        </w:rPr>
+      </w:pPr>
+      <w:r>
+        <w:rPr>
+          <w:lang w:val="en-IN"/>
+        </w:rPr>
+        <w:t xml:space="preserve">Building dimension and fact tables using a Snowflake schema. </w:t>
+      </w:r>
+    </w:p>
+    <w:p>
+      <w:pPr>
+        <w:numPr>
+          <w:ilvl w:val="0"/>
+          <w:numId w:val="11"/>
+        </w:numPr>
+        <w:spacing w:after="0" w:line="240" w:lineRule="auto"/>
+        <w:rPr>
+          <w:lang w:val="en-IN"/>
+        </w:rPr>
+      </w:pPr>
+      <w:r>
+        <w:rPr>
+          <w:lang w:val="en-IN"/>
+        </w:rPr>
+        <w:t xml:space="preserve">Supporting analytical SQL queries. </w:t>
+      </w:r>
+    </w:p>
+    <w:p>
+      <w:pPr>
+        <w:numPr>
+          <w:ilvl w:val="0"/>
+          <w:numId w:val="11"/>
+        </w:numPr>
+        <w:spacing w:after="0" w:line="240" w:lineRule="auto"/>
+        <w:rPr>
+          <w:lang w:val="en-IN"/>
+        </w:rPr>
+      </w:pPr>
+      <w:r>
+        <w:rPr>
+          <w:lang w:val="en-IN"/>
+        </w:rPr>
+        <w:t>Maintaining auditability through ETL load metadata.</w:t>
       </w:r>
     </w:p>
     <w:p>
@@ -272,8 +513,43 @@
       </w:r>
     </w:p>
     <w:p>
+      <w:pPr>
+        <w:rPr>
+          <w:lang w:val="en-IN"/>
+        </w:rPr>
+      </w:pPr>
       <w:r>
-        <w:t>Each JSON document represents one listening event. The event contains transactional information (user and timestamp) together with descriptive music metadata such as artist, release and recording.</w:t>
+        <w:rPr>
+          <w:lang w:val="en-IN"/>
+        </w:rPr>
+        <w:t xml:space="preserve">The </w:t>
+      </w:r>
+      <w:proofErr w:type="spellStart"/>
+      <w:r>
+        <w:rPr>
+          <w:lang w:val="en-IN"/>
+        </w:rPr>
+        <w:t>ListenBrainz</w:t>
+      </w:r>
+      <w:proofErr w:type="spellEnd"/>
+      <w:r>
+        <w:rPr>
+          <w:lang w:val="en-IN"/>
+        </w:rPr>
+        <w:t xml:space="preserve"> dataset consists of NDJSON files, where each line represents a single music listening event. Every event contains information about the user, the time the track was played, and the associated music metadata such as the artist, release, and recording.</w:t>
+      </w:r>
+    </w:p>
+    <w:p>
+      <w:pPr>
+        <w:rPr>
+          <w:lang w:val="en-IN"/>
+        </w:rPr>
+      </w:pPr>
+      <w:r>
+        <w:rPr>
+          <w:lang w:val="en-IN"/>
+        </w:rPr>
+        <w:t>Most of the business information is stored within nested JSON objects, making the source semi-structured in nature. This allows the dataset to capture different levels of metadata while preserving the complete listening event.</w:t>
       </w:r>
     </w:p>
     <w:p>
@@ -286,64 +562,733 @@
     </w:p>
     <w:p>
       <w:r>
-        <w:t>Key observations:</w:t>
-      </w:r>
-      <w:r>
-        <w:br/>
-        <w:t>• Every JSON record represents a listening event.</w:t>
-      </w:r>
-      <w:r>
-        <w:br/>
-        <w:t xml:space="preserve">• </w:t>
+        <w:t xml:space="preserve">Before designing the data warehouse and ETL pipeline, the source dataset was </w:t>
       </w:r>
       <w:proofErr w:type="spellStart"/>
       <w:r>
-        <w:t>recording_msid</w:t>
+        <w:t>analysed</w:t>
       </w:r>
       <w:proofErr w:type="spellEnd"/>
       <w:r>
-        <w:t xml:space="preserve">, </w:t>
+        <w:t xml:space="preserve"> to understand its structure, data quality, and business characteristics. The observations below directly influenced the dimensional model, ETL design, and data processing strategy adopted for this solution.</w:t>
       </w:r>
-      <w:proofErr w:type="spellStart"/>
-      <w:r>
-        <w:t>artist_msid</w:t>
-      </w:r>
-      <w:proofErr w:type="spellEnd"/>
-      <w:r>
-        <w:t xml:space="preserve"> and </w:t>
-      </w:r>
-      <w:proofErr w:type="spellStart"/>
-      <w:r>
-        <w:t>release_msid</w:t>
-      </w:r>
-      <w:proofErr w:type="spellEnd"/>
-      <w:r>
-        <w:t xml:space="preserve"> behave as stable business identifiers.</w:t>
-      </w:r>
-      <w:r>
-        <w:br/>
-        <w:t>• MBIDs are optional and frequently null.</w:t>
-      </w:r>
-      <w:r>
-        <w:br/>
-        <w:t>• Artist names are not reliable identifiers because formatting varies.</w:t>
-      </w:r>
-      <w:r>
-        <w:br/>
-        <w:t>• One release contains many recordings.</w:t>
-      </w:r>
-      <w:r>
-        <w:br/>
-        <w:t>• One recording appears in many listening events.</w:t>
-      </w:r>
-      <w:r>
-        <w:br/>
-        <w:t>Business Grain:</w:t>
-      </w:r>
-      <w:r>
-        <w:br/>
-        <w:t>One row = One user listening to one recording at one timestamp.</w:t>
-      </w:r>
+    </w:p>
+    <w:tbl>
+      <w:tblPr>
+        <w:tblStyle w:val="PlainTable1"/>
+        <w:tblW w:w="0" w:type="auto"/>
+        <w:tblInd w:w="-459" w:type="dxa"/>
+        <w:tblLook w:val="04A0" w:firstRow="1" w:lastRow="0" w:firstColumn="1" w:lastColumn="0" w:noHBand="0" w:noVBand="1"/>
+      </w:tblPr>
+      <w:tblGrid>
+        <w:gridCol w:w="709"/>
+        <w:gridCol w:w="4394"/>
+        <w:gridCol w:w="4212"/>
+      </w:tblGrid>
+      <w:tr>
+        <w:trPr>
+          <w:cnfStyle w:val="100000000000" w:firstRow="1" w:lastRow="0" w:firstColumn="0" w:lastColumn="0" w:oddVBand="0" w:evenVBand="0" w:oddHBand="0" w:evenHBand="0" w:firstRowFirstColumn="0" w:firstRowLastColumn="0" w:lastRowFirstColumn="0" w:lastRowLastColumn="0"/>
+        </w:trPr>
+        <w:tc>
+          <w:tcPr>
+            <w:cnfStyle w:val="001000000000" w:firstRow="0" w:lastRow="0" w:firstColumn="1" w:lastColumn="0" w:oddVBand="0" w:evenVBand="0" w:oddHBand="0" w:evenHBand="0" w:firstRowFirstColumn="0" w:firstRowLastColumn="0" w:lastRowFirstColumn="0" w:lastRowLastColumn="0"/>
+            <w:tcW w:w="709" w:type="dxa"/>
+          </w:tcPr>
+          <w:p>
+            <w:pPr>
+              <w:rPr>
+                <w:lang w:val="en-IN"/>
+              </w:rPr>
+            </w:pPr>
+            <w:r>
+              <w:rPr>
+                <w:lang w:val="en-IN"/>
+              </w:rPr>
+              <w:t># No</w:t>
+            </w:r>
+          </w:p>
+        </w:tc>
+        <w:tc>
+          <w:tcPr>
+            <w:tcW w:w="4394" w:type="dxa"/>
+          </w:tcPr>
+          <w:p>
+            <w:pPr>
+              <w:cnfStyle w:val="100000000000" w:firstRow="1" w:lastRow="0" w:firstColumn="0" w:lastColumn="0" w:oddVBand="0" w:evenVBand="0" w:oddHBand="0" w:evenHBand="0" w:firstRowFirstColumn="0" w:firstRowLastColumn="0" w:lastRowFirstColumn="0" w:lastRowLastColumn="0"/>
+              <w:rPr>
+                <w:lang w:val="en-IN"/>
+              </w:rPr>
+            </w:pPr>
+            <w:r>
+              <w:rPr>
+                <w:lang w:val="en-IN"/>
+              </w:rPr>
+              <w:t>Observation</w:t>
+            </w:r>
+          </w:p>
+        </w:tc>
+        <w:tc>
+          <w:tcPr>
+            <w:tcW w:w="4212" w:type="dxa"/>
+          </w:tcPr>
+          <w:p>
+            <w:pPr>
+              <w:cnfStyle w:val="100000000000" w:firstRow="1" w:lastRow="0" w:firstColumn="0" w:lastColumn="0" w:oddVBand="0" w:evenVBand="0" w:oddHBand="0" w:evenHBand="0" w:firstRowFirstColumn="0" w:firstRowLastColumn="0" w:lastRowFirstColumn="0" w:lastRowLastColumn="0"/>
+              <w:rPr>
+                <w:lang w:val="en-IN"/>
+              </w:rPr>
+            </w:pPr>
+            <w:r>
+              <w:rPr>
+                <w:lang w:val="en-IN"/>
+              </w:rPr>
+              <w:t>Design Decision</w:t>
+            </w:r>
+          </w:p>
+        </w:tc>
+      </w:tr>
+      <w:tr>
+        <w:trPr>
+          <w:cnfStyle w:val="000000100000" w:firstRow="0" w:lastRow="0" w:firstColumn="0" w:lastColumn="0" w:oddVBand="0" w:evenVBand="0" w:oddHBand="1" w:evenHBand="0" w:firstRowFirstColumn="0" w:firstRowLastColumn="0" w:lastRowFirstColumn="0" w:lastRowLastColumn="0"/>
+        </w:trPr>
+        <w:tc>
+          <w:tcPr>
+            <w:cnfStyle w:val="001000000000" w:firstRow="0" w:lastRow="0" w:firstColumn="1" w:lastColumn="0" w:oddVBand="0" w:evenVBand="0" w:oddHBand="0" w:evenHBand="0" w:firstRowFirstColumn="0" w:firstRowLastColumn="0" w:lastRowFirstColumn="0" w:lastRowLastColumn="0"/>
+            <w:tcW w:w="709" w:type="dxa"/>
+          </w:tcPr>
+          <w:p>
+            <w:pPr>
+              <w:rPr>
+                <w:lang w:val="en-IN"/>
+              </w:rPr>
+            </w:pPr>
+            <w:r>
+              <w:rPr>
+                <w:lang w:val="en-IN"/>
+              </w:rPr>
+              <w:t>1</w:t>
+            </w:r>
+          </w:p>
+        </w:tc>
+        <w:tc>
+          <w:tcPr>
+            <w:tcW w:w="4394" w:type="dxa"/>
+          </w:tcPr>
+          <w:p>
+            <w:pPr>
+              <w:cnfStyle w:val="000000100000" w:firstRow="0" w:lastRow="0" w:firstColumn="0" w:lastColumn="0" w:oddVBand="0" w:evenVBand="0" w:oddHBand="1" w:evenHBand="0" w:firstRowFirstColumn="0" w:firstRowLastColumn="0" w:lastRowFirstColumn="0" w:lastRowLastColumn="0"/>
+            </w:pPr>
+            <w:r>
+              <w:t>One JSON record represents one listening event. The same user may appear multiple times in the dataset with different listening timestamps and recordings.</w:t>
+            </w:r>
+          </w:p>
+        </w:tc>
+        <w:tc>
+          <w:tcPr>
+            <w:tcW w:w="4212" w:type="dxa"/>
+          </w:tcPr>
+          <w:p>
+            <w:pPr>
+              <w:cnfStyle w:val="000000100000" w:firstRow="0" w:lastRow="0" w:firstColumn="0" w:lastColumn="0" w:oddVBand="0" w:evenVBand="0" w:oddHBand="1" w:evenHBand="0" w:firstRowFirstColumn="0" w:firstRowLastColumn="0" w:lastRowFirstColumn="0" w:lastRowLastColumn="0"/>
+            </w:pPr>
+            <w:r>
+              <w:t>The FACT_LISTEN table is designed at the grain of one listening event, ensuring that every listening activity is captured independently.</w:t>
+            </w:r>
+          </w:p>
+        </w:tc>
+      </w:tr>
+      <w:tr>
+        <w:tc>
+          <w:tcPr>
+            <w:cnfStyle w:val="001000000000" w:firstRow="0" w:lastRow="0" w:firstColumn="1" w:lastColumn="0" w:oddVBand="0" w:evenVBand="0" w:oddHBand="0" w:evenHBand="0" w:firstRowFirstColumn="0" w:firstRowLastColumn="0" w:lastRowFirstColumn="0" w:lastRowLastColumn="0"/>
+            <w:tcW w:w="709" w:type="dxa"/>
+          </w:tcPr>
+          <w:p>
+            <w:pPr>
+              <w:rPr>
+                <w:lang w:val="en-IN"/>
+              </w:rPr>
+            </w:pPr>
+            <w:r>
+              <w:rPr>
+                <w:lang w:val="en-IN"/>
+              </w:rPr>
+              <w:t>2</w:t>
+            </w:r>
+          </w:p>
+        </w:tc>
+        <w:tc>
+          <w:tcPr>
+            <w:tcW w:w="4394" w:type="dxa"/>
+          </w:tcPr>
+          <w:p>
+            <w:pPr>
+              <w:cnfStyle w:val="000000000000" w:firstRow="0" w:lastRow="0" w:firstColumn="0" w:lastColumn="0" w:oddVBand="0" w:evenVBand="0" w:oddHBand="0" w:evenHBand="0" w:firstRowFirstColumn="0" w:firstRowLastColumn="0" w:lastRowFirstColumn="0" w:lastRowLastColumn="0"/>
+            </w:pPr>
+            <w:r>
+              <w:t xml:space="preserve">The source data is semi-structured (nested JSON). Most business attributes are stored within nested JSON objects such as </w:t>
+            </w:r>
+            <w:proofErr w:type="spellStart"/>
+            <w:r>
+              <w:t>track_metadata</w:t>
+            </w:r>
+            <w:proofErr w:type="spellEnd"/>
+            <w:r>
+              <w:t xml:space="preserve"> and </w:t>
+            </w:r>
+            <w:proofErr w:type="spellStart"/>
+            <w:r>
+              <w:t>track_</w:t>
+            </w:r>
+            <w:proofErr w:type="gramStart"/>
+            <w:r>
+              <w:t>metadata.additional</w:t>
+            </w:r>
+            <w:proofErr w:type="gramEnd"/>
+            <w:r>
+              <w:t>_info</w:t>
+            </w:r>
+            <w:proofErr w:type="spellEnd"/>
+            <w:r>
+              <w:t>.</w:t>
+            </w:r>
+          </w:p>
+        </w:tc>
+        <w:tc>
+          <w:tcPr>
+            <w:tcW w:w="4212" w:type="dxa"/>
+          </w:tcPr>
+          <w:p>
+            <w:pPr>
+              <w:cnfStyle w:val="000000000000" w:firstRow="0" w:lastRow="0" w:firstColumn="0" w:lastColumn="0" w:oddVBand="0" w:evenVBand="0" w:oddHBand="0" w:evenHBand="0" w:firstRowFirstColumn="0" w:firstRowLastColumn="0" w:lastRowFirstColumn="0" w:lastRowLastColumn="0"/>
+            </w:pPr>
+            <w:r>
+              <w:t xml:space="preserve">The Bronze layer stores the raw JSON document without modification. Required business attributes are extracted and flattened during the </w:t>
+            </w:r>
+            <w:proofErr w:type="gramStart"/>
+            <w:r>
+              <w:t>Silver</w:t>
+            </w:r>
+            <w:proofErr w:type="gramEnd"/>
+            <w:r>
+              <w:t xml:space="preserve"> layer transformation.</w:t>
+            </w:r>
+          </w:p>
+        </w:tc>
+      </w:tr>
+      <w:tr>
+        <w:trPr>
+          <w:cnfStyle w:val="000000100000" w:firstRow="0" w:lastRow="0" w:firstColumn="0" w:lastColumn="0" w:oddVBand="0" w:evenVBand="0" w:oddHBand="1" w:evenHBand="0" w:firstRowFirstColumn="0" w:firstRowLastColumn="0" w:lastRowFirstColumn="0" w:lastRowLastColumn="0"/>
+        </w:trPr>
+        <w:tc>
+          <w:tcPr>
+            <w:cnfStyle w:val="001000000000" w:firstRow="0" w:lastRow="0" w:firstColumn="1" w:lastColumn="0" w:oddVBand="0" w:evenVBand="0" w:oddHBand="0" w:evenHBand="0" w:firstRowFirstColumn="0" w:firstRowLastColumn="0" w:lastRowFirstColumn="0" w:lastRowLastColumn="0"/>
+            <w:tcW w:w="709" w:type="dxa"/>
+          </w:tcPr>
+          <w:p>
+            <w:pPr>
+              <w:rPr>
+                <w:lang w:val="en-IN"/>
+              </w:rPr>
+            </w:pPr>
+            <w:r>
+              <w:rPr>
+                <w:lang w:val="en-IN"/>
+              </w:rPr>
+              <w:t>3</w:t>
+            </w:r>
+          </w:p>
+        </w:tc>
+        <w:tc>
+          <w:tcPr>
+            <w:tcW w:w="4394" w:type="dxa"/>
+          </w:tcPr>
+          <w:p>
+            <w:pPr>
+              <w:cnfStyle w:val="000000100000" w:firstRow="0" w:lastRow="0" w:firstColumn="0" w:lastColumn="0" w:oddVBand="0" w:evenVBand="0" w:oddHBand="1" w:evenHBand="0" w:firstRowFirstColumn="0" w:firstRowLastColumn="0" w:lastRowFirstColumn="0" w:lastRowLastColumn="0"/>
+              <w:rPr>
+                <w:lang w:val="en-IN"/>
+              </w:rPr>
+            </w:pPr>
+            <w:r>
+              <w:rPr>
+                <w:lang w:val="en-IN"/>
+              </w:rPr>
+              <w:t xml:space="preserve">Multilingual dataset (contains Unicode </w:t>
+            </w:r>
+            <w:r>
+              <w:rPr>
+                <w:lang w:val="en-IN"/>
+              </w:rPr>
+              <w:lastRenderedPageBreak/>
+              <w:t>characters)</w:t>
+            </w:r>
+          </w:p>
+        </w:tc>
+        <w:tc>
+          <w:tcPr>
+            <w:tcW w:w="4212" w:type="dxa"/>
+          </w:tcPr>
+          <w:p>
+            <w:pPr>
+              <w:cnfStyle w:val="000000100000" w:firstRow="0" w:lastRow="0" w:firstColumn="0" w:lastColumn="0" w:oddVBand="0" w:evenVBand="0" w:oddHBand="1" w:evenHBand="0" w:firstRowFirstColumn="0" w:firstRowLastColumn="0" w:lastRowFirstColumn="0" w:lastRowLastColumn="0"/>
+              <w:rPr>
+                <w:lang w:val="en-IN"/>
+              </w:rPr>
+            </w:pPr>
+            <w:r>
+              <w:rPr>
+                <w:lang w:val="en-IN"/>
+              </w:rPr>
+              <w:lastRenderedPageBreak/>
+              <w:t xml:space="preserve">UTF-8 encoding preserved throughout the </w:t>
+            </w:r>
+            <w:r>
+              <w:rPr>
+                <w:lang w:val="en-IN"/>
+              </w:rPr>
+              <w:lastRenderedPageBreak/>
+              <w:t>pipeline to avoid data loss during conversion</w:t>
+            </w:r>
+          </w:p>
+        </w:tc>
+      </w:tr>
+      <w:tr>
+        <w:tc>
+          <w:tcPr>
+            <w:cnfStyle w:val="001000000000" w:firstRow="0" w:lastRow="0" w:firstColumn="1" w:lastColumn="0" w:oddVBand="0" w:evenVBand="0" w:oddHBand="0" w:evenHBand="0" w:firstRowFirstColumn="0" w:firstRowLastColumn="0" w:lastRowFirstColumn="0" w:lastRowLastColumn="0"/>
+            <w:tcW w:w="709" w:type="dxa"/>
+          </w:tcPr>
+          <w:p>
+            <w:pPr>
+              <w:rPr>
+                <w:lang w:val="en-IN"/>
+              </w:rPr>
+            </w:pPr>
+            <w:r>
+              <w:rPr>
+                <w:lang w:val="en-IN"/>
+              </w:rPr>
+              <w:lastRenderedPageBreak/>
+              <w:t>4</w:t>
+            </w:r>
+          </w:p>
+        </w:tc>
+        <w:tc>
+          <w:tcPr>
+            <w:tcW w:w="4394" w:type="dxa"/>
+          </w:tcPr>
+          <w:p>
+            <w:pPr>
+              <w:cnfStyle w:val="000000000000" w:firstRow="0" w:lastRow="0" w:firstColumn="0" w:lastColumn="0" w:oddVBand="0" w:evenVBand="0" w:oddHBand="0" w:evenHBand="0" w:firstRowFirstColumn="0" w:firstRowLastColumn="0" w:lastRowFirstColumn="0" w:lastRowLastColumn="0"/>
+              <w:rPr>
+                <w:lang w:val="en-IN"/>
+              </w:rPr>
+            </w:pPr>
+            <w:r>
+              <w:t xml:space="preserve">Some business attributes are optional and may contain null values. For example, </w:t>
+            </w:r>
+            <w:proofErr w:type="spellStart"/>
+            <w:r>
+              <w:t>release_msid</w:t>
+            </w:r>
+            <w:proofErr w:type="spellEnd"/>
+            <w:r>
+              <w:t xml:space="preserve">, </w:t>
+            </w:r>
+            <w:proofErr w:type="spellStart"/>
+            <w:r>
+              <w:t>release_name</w:t>
+            </w:r>
+            <w:proofErr w:type="spellEnd"/>
+            <w:r>
+              <w:t xml:space="preserve">, </w:t>
+            </w:r>
+            <w:proofErr w:type="spellStart"/>
+            <w:r>
+              <w:t>recording_mbid</w:t>
+            </w:r>
+            <w:proofErr w:type="spellEnd"/>
+            <w:r>
+              <w:t xml:space="preserve">, and </w:t>
+            </w:r>
+            <w:proofErr w:type="spellStart"/>
+            <w:r>
+              <w:t>release_mbid</w:t>
+            </w:r>
+            <w:proofErr w:type="spellEnd"/>
+            <w:r>
+              <w:t xml:space="preserve"> are not always available for every listening event.</w:t>
+            </w:r>
+          </w:p>
+        </w:tc>
+        <w:tc>
+          <w:tcPr>
+            <w:tcW w:w="4212" w:type="dxa"/>
+          </w:tcPr>
+          <w:p>
+            <w:pPr>
+              <w:cnfStyle w:val="000000000000" w:firstRow="0" w:lastRow="0" w:firstColumn="0" w:lastColumn="0" w:oddVBand="0" w:evenVBand="0" w:oddHBand="0" w:evenHBand="0" w:firstRowFirstColumn="0" w:firstRowLastColumn="0" w:lastRowFirstColumn="0" w:lastRowLastColumn="0"/>
+              <w:rPr>
+                <w:lang w:val="en-IN"/>
+              </w:rPr>
+            </w:pPr>
+            <w:r>
+              <w:t>The ETL validates mandatory business keys before loading dimensions and handles optional attributes gracefully without failing the load process.</w:t>
+            </w:r>
+          </w:p>
+        </w:tc>
+      </w:tr>
+      <w:tr>
+        <w:trPr>
+          <w:cnfStyle w:val="000000100000" w:firstRow="0" w:lastRow="0" w:firstColumn="0" w:lastColumn="0" w:oddVBand="0" w:evenVBand="0" w:oddHBand="1" w:evenHBand="0" w:firstRowFirstColumn="0" w:firstRowLastColumn="0" w:lastRowFirstColumn="0" w:lastRowLastColumn="0"/>
+        </w:trPr>
+        <w:tc>
+          <w:tcPr>
+            <w:cnfStyle w:val="001000000000" w:firstRow="0" w:lastRow="0" w:firstColumn="1" w:lastColumn="0" w:oddVBand="0" w:evenVBand="0" w:oddHBand="0" w:evenHBand="0" w:firstRowFirstColumn="0" w:firstRowLastColumn="0" w:lastRowFirstColumn="0" w:lastRowLastColumn="0"/>
+            <w:tcW w:w="709" w:type="dxa"/>
+          </w:tcPr>
+          <w:p>
+            <w:pPr>
+              <w:rPr>
+                <w:lang w:val="en-IN"/>
+              </w:rPr>
+            </w:pPr>
+            <w:r>
+              <w:rPr>
+                <w:lang w:val="en-IN"/>
+              </w:rPr>
+              <w:t>5</w:t>
+            </w:r>
+          </w:p>
+        </w:tc>
+        <w:tc>
+          <w:tcPr>
+            <w:tcW w:w="4394" w:type="dxa"/>
+          </w:tcPr>
+          <w:p>
+            <w:pPr>
+              <w:cnfStyle w:val="000000100000" w:firstRow="0" w:lastRow="0" w:firstColumn="0" w:lastColumn="0" w:oddVBand="0" w:evenVBand="0" w:oddHBand="1" w:evenHBand="0" w:firstRowFirstColumn="0" w:firstRowLastColumn="0" w:lastRowFirstColumn="0" w:lastRowLastColumn="0"/>
+              <w:rPr>
+                <w:lang w:val="en-IN"/>
+              </w:rPr>
+            </w:pPr>
+            <w:r>
+              <w:t xml:space="preserve">MSIDs act as stable business identifiers. The dataset consistently provides </w:t>
+            </w:r>
+            <w:proofErr w:type="spellStart"/>
+            <w:r>
+              <w:t>artist_msid</w:t>
+            </w:r>
+            <w:proofErr w:type="spellEnd"/>
+            <w:r>
+              <w:t xml:space="preserve">, </w:t>
+            </w:r>
+            <w:proofErr w:type="spellStart"/>
+            <w:r>
+              <w:t>release_msid</w:t>
+            </w:r>
+            <w:proofErr w:type="spellEnd"/>
+            <w:r>
+              <w:t xml:space="preserve">, and </w:t>
+            </w:r>
+            <w:proofErr w:type="spellStart"/>
+            <w:r>
+              <w:t>recording_msid</w:t>
+            </w:r>
+            <w:proofErr w:type="spellEnd"/>
+            <w:r>
+              <w:t xml:space="preserve"> for identifying music entities.</w:t>
+            </w:r>
+          </w:p>
+        </w:tc>
+        <w:tc>
+          <w:tcPr>
+            <w:tcW w:w="4212" w:type="dxa"/>
+          </w:tcPr>
+          <w:p>
+            <w:pPr>
+              <w:cnfStyle w:val="000000100000" w:firstRow="0" w:lastRow="0" w:firstColumn="0" w:lastColumn="0" w:oddVBand="0" w:evenVBand="0" w:oddHBand="1" w:evenHBand="0" w:firstRowFirstColumn="0" w:firstRowLastColumn="0" w:lastRowFirstColumn="0" w:lastRowLastColumn="0"/>
+              <w:rPr>
+                <w:lang w:val="en-IN"/>
+              </w:rPr>
+            </w:pPr>
+            <w:r>
+              <w:t>MSIDs are used as the natural (business) keys for the Artist, Release, and Recording dimensions, while surrogate keys are generated within the warehouse for efficient joins.</w:t>
+            </w:r>
+          </w:p>
+        </w:tc>
+      </w:tr>
+      <w:tr>
+        <w:tc>
+          <w:tcPr>
+            <w:cnfStyle w:val="001000000000" w:firstRow="0" w:lastRow="0" w:firstColumn="1" w:lastColumn="0" w:oddVBand="0" w:evenVBand="0" w:oddHBand="0" w:evenHBand="0" w:firstRowFirstColumn="0" w:firstRowLastColumn="0" w:lastRowFirstColumn="0" w:lastRowLastColumn="0"/>
+            <w:tcW w:w="709" w:type="dxa"/>
+          </w:tcPr>
+          <w:p>
+            <w:pPr>
+              <w:rPr>
+                <w:lang w:val="en-IN"/>
+              </w:rPr>
+            </w:pPr>
+            <w:r>
+              <w:rPr>
+                <w:lang w:val="en-IN"/>
+              </w:rPr>
+              <w:t>6</w:t>
+            </w:r>
+          </w:p>
+        </w:tc>
+        <w:tc>
+          <w:tcPr>
+            <w:tcW w:w="4394" w:type="dxa"/>
+          </w:tcPr>
+          <w:p>
+            <w:pPr>
+              <w:cnfStyle w:val="000000000000" w:firstRow="0" w:lastRow="0" w:firstColumn="0" w:lastColumn="0" w:oddVBand="0" w:evenVBand="0" w:oddHBand="0" w:evenHBand="0" w:firstRowFirstColumn="0" w:firstRowLastColumn="0" w:lastRowFirstColumn="0" w:lastRowLastColumn="0"/>
+            </w:pPr>
+            <w:r>
+              <w:t xml:space="preserve">The dataset provides only </w:t>
+            </w:r>
+            <w:proofErr w:type="spellStart"/>
+            <w:r>
+              <w:t>user_name</w:t>
+            </w:r>
+            <w:proofErr w:type="spellEnd"/>
+            <w:r>
+              <w:t xml:space="preserve"> to identify users. No separate user identifier is available in the source data.</w:t>
+            </w:r>
+          </w:p>
+        </w:tc>
+        <w:tc>
+          <w:tcPr>
+            <w:tcW w:w="4212" w:type="dxa"/>
+          </w:tcPr>
+          <w:tbl>
+            <w:tblPr>
+              <w:tblW w:w="0" w:type="auto"/>
+              <w:tblCellSpacing w:w="15" w:type="dxa"/>
+              <w:tblCellMar>
+                <w:top w:w="15" w:type="dxa"/>
+                <w:left w:w="15" w:type="dxa"/>
+                <w:bottom w:w="15" w:type="dxa"/>
+                <w:right w:w="15" w:type="dxa"/>
+              </w:tblCellMar>
+              <w:tblLook w:val="04A0" w:firstRow="1" w:lastRow="0" w:firstColumn="1" w:lastColumn="0" w:noHBand="0" w:noVBand="1"/>
+            </w:tblPr>
+            <w:tblGrid>
+              <w:gridCol w:w="3996"/>
+            </w:tblGrid>
+            <w:tr>
+              <w:trPr>
+                <w:tblCellSpacing w:w="15" w:type="dxa"/>
+              </w:trPr>
+              <w:tc>
+                <w:tcPr>
+                  <w:tcW w:w="0" w:type="auto"/>
+                  <w:vAlign w:val="center"/>
+                </w:tcPr>
+                <w:p>
+                  <w:pPr>
+                    <w:spacing w:after="0" w:line="240" w:lineRule="auto"/>
+                    <w:rPr>
+                      <w:lang w:val="en-IN"/>
+                    </w:rPr>
+                  </w:pPr>
+                  <w:proofErr w:type="spellStart"/>
+                  <w:r>
+                    <w:rPr>
+                      <w:lang w:val="en-IN"/>
+                    </w:rPr>
+                    <w:t>user_name</w:t>
+                  </w:r>
+                  <w:proofErr w:type="spellEnd"/>
+                  <w:r>
+                    <w:rPr>
+                      <w:lang w:val="en-IN"/>
+                    </w:rPr>
+                    <w:t xml:space="preserve"> is treated as the natural business key for the User dimension. This assumption is documented since no alternative unique identifier is available in the dataset.</w:t>
+                  </w:r>
+                </w:p>
+              </w:tc>
+            </w:tr>
+          </w:tbl>
+          <w:p>
+            <w:pPr>
+              <w:cnfStyle w:val="000000000000" w:firstRow="0" w:lastRow="0" w:firstColumn="0" w:lastColumn="0" w:oddVBand="0" w:evenVBand="0" w:oddHBand="0" w:evenHBand="0" w:firstRowFirstColumn="0" w:firstRowLastColumn="0" w:lastRowFirstColumn="0" w:lastRowLastColumn="0"/>
+              <w:rPr>
+                <w:vanish/>
+                <w:lang w:val="en-IN"/>
+              </w:rPr>
+            </w:pPr>
+          </w:p>
+          <w:tbl>
+            <w:tblPr>
+              <w:tblW w:w="0" w:type="auto"/>
+              <w:tblCellSpacing w:w="15" w:type="dxa"/>
+              <w:tblCellMar>
+                <w:top w:w="15" w:type="dxa"/>
+                <w:left w:w="15" w:type="dxa"/>
+                <w:bottom w:w="15" w:type="dxa"/>
+                <w:right w:w="15" w:type="dxa"/>
+              </w:tblCellMar>
+              <w:tblLook w:val="04A0" w:firstRow="1" w:lastRow="0" w:firstColumn="1" w:lastColumn="0" w:noHBand="0" w:noVBand="1"/>
+            </w:tblPr>
+            <w:tblGrid>
+              <w:gridCol w:w="96"/>
+            </w:tblGrid>
+            <w:tr>
+              <w:trPr>
+                <w:tblCellSpacing w:w="15" w:type="dxa"/>
+              </w:trPr>
+              <w:tc>
+                <w:tcPr>
+                  <w:tcW w:w="0" w:type="auto"/>
+                  <w:vAlign w:val="center"/>
+                  <w:hideMark/>
+                </w:tcPr>
+                <w:p>
+                  <w:pPr>
+                    <w:spacing w:after="0" w:line="240" w:lineRule="auto"/>
+                    <w:rPr>
+                      <w:lang w:val="en-IN"/>
+                    </w:rPr>
+                  </w:pPr>
+                </w:p>
+              </w:tc>
+            </w:tr>
+          </w:tbl>
+          <w:p>
+            <w:pPr>
+              <w:cnfStyle w:val="000000000000" w:firstRow="0" w:lastRow="0" w:firstColumn="0" w:lastColumn="0" w:oddVBand="0" w:evenVBand="0" w:oddHBand="0" w:evenHBand="0" w:firstRowFirstColumn="0" w:firstRowLastColumn="0" w:lastRowFirstColumn="0" w:lastRowLastColumn="0"/>
+              <w:rPr>
+                <w:lang w:val="en-IN"/>
+              </w:rPr>
+            </w:pPr>
+          </w:p>
+        </w:tc>
+      </w:tr>
+      <w:tr>
+        <w:trPr>
+          <w:cnfStyle w:val="000000100000" w:firstRow="0" w:lastRow="0" w:firstColumn="0" w:lastColumn="0" w:oddVBand="0" w:evenVBand="0" w:oddHBand="1" w:evenHBand="0" w:firstRowFirstColumn="0" w:firstRowLastColumn="0" w:lastRowFirstColumn="0" w:lastRowLastColumn="0"/>
+        </w:trPr>
+        <w:tc>
+          <w:tcPr>
+            <w:cnfStyle w:val="001000000000" w:firstRow="0" w:lastRow="0" w:firstColumn="1" w:lastColumn="0" w:oddVBand="0" w:evenVBand="0" w:oddHBand="0" w:evenHBand="0" w:firstRowFirstColumn="0" w:firstRowLastColumn="0" w:lastRowFirstColumn="0" w:lastRowLastColumn="0"/>
+            <w:tcW w:w="709" w:type="dxa"/>
+          </w:tcPr>
+          <w:p>
+            <w:pPr>
+              <w:rPr>
+                <w:lang w:val="en-IN"/>
+              </w:rPr>
+            </w:pPr>
+            <w:r>
+              <w:rPr>
+                <w:lang w:val="en-IN"/>
+              </w:rPr>
+              <w:t>7</w:t>
+            </w:r>
+          </w:p>
+        </w:tc>
+        <w:tc>
+          <w:tcPr>
+            <w:tcW w:w="4394" w:type="dxa"/>
+          </w:tcPr>
+          <w:p>
+            <w:pPr>
+              <w:cnfStyle w:val="000000100000" w:firstRow="0" w:lastRow="0" w:firstColumn="0" w:lastColumn="0" w:oddVBand="0" w:evenVBand="0" w:oddHBand="1" w:evenHBand="0" w:firstRowFirstColumn="0" w:firstRowLastColumn="0" w:lastRowFirstColumn="0" w:lastRowLastColumn="0"/>
+            </w:pPr>
+            <w:r>
+              <w:t>Some source values contain Unicode replacement characters (</w:t>
+            </w:r>
+            <w:r>
+              <w:rPr>
+                <w:rFonts w:cs="Calibri"/>
+              </w:rPr>
+              <w:t>�</w:t>
+            </w:r>
+            <w:r>
+              <w:t>). These values originate from the source dataset rather than the ETL process.</w:t>
+            </w:r>
+          </w:p>
+        </w:tc>
+        <w:tc>
+          <w:tcPr>
+            <w:tcW w:w="4212" w:type="dxa"/>
+          </w:tcPr>
+          <w:p>
+            <w:pPr>
+              <w:cnfStyle w:val="000000100000" w:firstRow="0" w:lastRow="0" w:firstColumn="0" w:lastColumn="0" w:oddVBand="0" w:evenVBand="0" w:oddHBand="1" w:evenHBand="0" w:firstRowFirstColumn="0" w:firstRowLastColumn="0" w:lastRowFirstColumn="0" w:lastRowLastColumn="0"/>
+            </w:pPr>
+            <w:r>
+              <w:t>Source values are preserved exactly as received to maintain data integrity. No automatic correction or transformation is performed on potentially corrupted source values.</w:t>
+            </w:r>
+          </w:p>
+        </w:tc>
+      </w:tr>
+      <w:tr>
+        <w:tc>
+          <w:tcPr>
+            <w:cnfStyle w:val="001000000000" w:firstRow="0" w:lastRow="0" w:firstColumn="1" w:lastColumn="0" w:oddVBand="0" w:evenVBand="0" w:oddHBand="0" w:evenHBand="0" w:firstRowFirstColumn="0" w:firstRowLastColumn="0" w:lastRowFirstColumn="0" w:lastRowLastColumn="0"/>
+            <w:tcW w:w="709" w:type="dxa"/>
+          </w:tcPr>
+          <w:p>
+            <w:pPr>
+              <w:rPr>
+                <w:lang w:val="en-IN"/>
+              </w:rPr>
+            </w:pPr>
+            <w:r>
+              <w:rPr>
+                <w:lang w:val="en-IN"/>
+              </w:rPr>
+              <w:t>8</w:t>
+            </w:r>
+          </w:p>
+        </w:tc>
+        <w:tc>
+          <w:tcPr>
+            <w:tcW w:w="4394" w:type="dxa"/>
+          </w:tcPr>
+          <w:p>
+            <w:pPr>
+              <w:cnfStyle w:val="000000000000" w:firstRow="0" w:lastRow="0" w:firstColumn="0" w:lastColumn="0" w:oddVBand="0" w:evenVBand="0" w:oddHBand="0" w:evenHBand="0" w:firstRowFirstColumn="0" w:firstRowLastColumn="0" w:lastRowFirstColumn="0" w:lastRowLastColumn="0"/>
+            </w:pPr>
+            <w:r>
+              <w:t xml:space="preserve">The same user may listen to the same recording multiple times. These records differ by the </w:t>
+            </w:r>
+            <w:proofErr w:type="spellStart"/>
+            <w:r>
+              <w:t>listened_at</w:t>
+            </w:r>
+            <w:proofErr w:type="spellEnd"/>
+            <w:r>
+              <w:t xml:space="preserve"> timestamp and represent separate listening events rather than duplicate records.</w:t>
+            </w:r>
+          </w:p>
+        </w:tc>
+        <w:tc>
+          <w:tcPr>
+            <w:tcW w:w="4212" w:type="dxa"/>
+          </w:tcPr>
+          <w:p>
+            <w:pPr>
+              <w:cnfStyle w:val="000000000000" w:firstRow="0" w:lastRow="0" w:firstColumn="0" w:lastColumn="0" w:oddVBand="0" w:evenVBand="0" w:oddHBand="0" w:evenHBand="0" w:firstRowFirstColumn="0" w:firstRowLastColumn="0" w:lastRowFirstColumn="0" w:lastRowLastColumn="0"/>
+            </w:pPr>
+            <w:r>
+              <w:t>Each listening event is loaded into the Fact table independently, while dimensions are loaded idempotently using their respective business keys.</w:t>
+            </w:r>
+          </w:p>
+        </w:tc>
+      </w:tr>
+    </w:tbl>
+    <w:p>
+      <w:pPr>
+        <w:rPr>
+          <w:lang w:val="en-IN"/>
+        </w:rPr>
+      </w:pPr>
     </w:p>
     <w:p>
       <w:pPr>
@@ -354,33 +1299,135 @@
       </w:r>
     </w:p>
     <w:p>
+      <w:pPr>
+        <w:pStyle w:val="ListParagraph"/>
+        <w:numPr>
+          <w:ilvl w:val="0"/>
+          <w:numId w:val="12"/>
+        </w:numPr>
+        <w:rPr>
+          <w:lang w:val="en-IN"/>
+        </w:rPr>
+      </w:pPr>
       <w:r>
-        <w:t>• Source timestamps are UTC.</w:t>
-      </w:r>
-      <w:r>
-        <w:br/>
-        <w:t>• A recording belongs to one artist and one release.</w:t>
-      </w:r>
-      <w:r>
-        <w:br/>
-        <w:t>• Surrogate keys are generated inside the warehouse.</w:t>
-      </w:r>
-      <w:r>
-        <w:br/>
-        <w:t>• Duplicate events are detected during ETL.</w:t>
-      </w:r>
-      <w:r>
-        <w:br/>
-        <w:t>• Source files are immutable after ingestion.</w:t>
+        <w:t>Source timestamps are stored as Unix epoch values and are assumed to represent UTC time.</w:t>
       </w:r>
     </w:p>
     <w:p>
       <w:pPr>
+        <w:pStyle w:val="ListParagraph"/>
+        <w:numPr>
+          <w:ilvl w:val="0"/>
+          <w:numId w:val="12"/>
+        </w:numPr>
+        <w:rPr>
+          <w:lang w:val="en-IN"/>
+        </w:rPr>
+      </w:pPr>
+      <w:r>
+        <w:rPr>
+          <w:lang w:val="en-IN"/>
+        </w:rPr>
+        <w:t xml:space="preserve">A recording is assumed to belong to a single artist and a single release, based on the structure of the source dataset. </w:t>
+      </w:r>
+    </w:p>
+    <w:p>
+      <w:pPr>
+        <w:pStyle w:val="ListParagraph"/>
+        <w:numPr>
+          <w:ilvl w:val="0"/>
+          <w:numId w:val="12"/>
+        </w:numPr>
+        <w:rPr>
+          <w:lang w:val="en-IN"/>
+        </w:rPr>
+      </w:pPr>
+      <w:r>
+        <w:rPr>
+          <w:lang w:val="en-IN"/>
+        </w:rPr>
+        <w:t xml:space="preserve">Surrogate keys are generated within the data warehouse, while the source business identifiers (MSIDs and </w:t>
+      </w:r>
+      <w:proofErr w:type="spellStart"/>
+      <w:r>
+        <w:rPr>
+          <w:lang w:val="en-IN"/>
+        </w:rPr>
+        <w:t>user_name</w:t>
+      </w:r>
+      <w:proofErr w:type="spellEnd"/>
+      <w:r>
+        <w:rPr>
+          <w:lang w:val="en-IN"/>
+        </w:rPr>
+        <w:t xml:space="preserve">) are retained as natural keys. </w:t>
+      </w:r>
+    </w:p>
+    <w:p>
+      <w:pPr>
+        <w:pStyle w:val="ListParagraph"/>
+        <w:numPr>
+          <w:ilvl w:val="0"/>
+          <w:numId w:val="12"/>
+        </w:numPr>
+        <w:rPr>
+          <w:lang w:val="en-IN"/>
+        </w:rPr>
+      </w:pPr>
+      <w:proofErr w:type="spellStart"/>
+      <w:r>
+        <w:rPr>
+          <w:lang w:val="en-IN"/>
+        </w:rPr>
+        <w:t>user_name</w:t>
+      </w:r>
+      <w:proofErr w:type="spellEnd"/>
+      <w:r>
+        <w:rPr>
+          <w:lang w:val="en-IN"/>
+        </w:rPr>
+        <w:t xml:space="preserve"> is assumed to uniquely identify a </w:t>
+      </w:r>
+      <w:proofErr w:type="spellStart"/>
+      <w:r>
+        <w:rPr>
+          <w:lang w:val="en-IN"/>
+        </w:rPr>
+        <w:t>ListenBrainz</w:t>
+      </w:r>
+      <w:proofErr w:type="spellEnd"/>
+      <w:r>
+        <w:rPr>
+          <w:lang w:val="en-IN"/>
+        </w:rPr>
+        <w:t xml:space="preserve"> user, as the source dataset does not provide a separate user identifier. </w:t>
+      </w:r>
+    </w:p>
+    <w:p>
+      <w:pPr>
+        <w:pStyle w:val="ListParagraph"/>
+        <w:numPr>
+          <w:ilvl w:val="0"/>
+          <w:numId w:val="12"/>
+        </w:numPr>
+      </w:pPr>
+      <w:r>
+        <w:rPr>
+          <w:lang w:val="en-IN"/>
+        </w:rPr>
+        <w:t>Source files are treated as immutable after ingestion. Once a file has been successfully processed, it is archived and is not expected to be modified.</w:t>
+      </w:r>
+    </w:p>
+    <w:p>
+      <w:pPr>
         <w:pStyle w:val="Heading1"/>
       </w:pPr>
       <w:r>
         <w:lastRenderedPageBreak/>
-        <w:t>6. Solution Architecture</w:t>
+        <w:t>3</w:t>
+      </w:r>
+      <w:r>
+        <w:t>. Solution Architecture</w:t>
       </w:r>
     </w:p>
     <w:p>
@@ -428,6 +1475,7 @@
         </w:drawing>
       </w:r>
     </w:p>
+    <w:p/>
     <w:p>
       <w:pPr>
         <w:pStyle w:val="Heading1"/>
@@ -1041,6 +2089,268 @@
     </w:lvl>
   </w:abstractNum>
   <w:abstractNum w:abstractNumId="9" w15:restartNumberingAfterBreak="0">
+    <w:nsid w:val="244B08C8"/>
+    <w:multiLevelType w:val="hybridMultilevel"/>
+    <w:tmpl w:val="32F6859C"/>
+    <w:lvl w:ilvl="0" w:tplc="40090001">
+      <w:start w:val="1"/>
+      <w:numFmt w:val="bullet"/>
+      <w:lvlText w:val=""/>
+      <w:lvlJc w:val="left"/>
+      <w:pPr>
+        <w:ind w:left="720" w:hanging="360"/>
+      </w:pPr>
+      <w:rPr>
+        <w:rFonts w:ascii="Symbol" w:hAnsi="Symbol" w:hint="default"/>
+      </w:rPr>
+    </w:lvl>
+    <w:lvl w:ilvl="1" w:tplc="40090003" w:tentative="1">
+      <w:start w:val="1"/>
+      <w:numFmt w:val="bullet"/>
+      <w:lvlText w:val="o"/>
+      <w:lvlJc w:val="left"/>
+      <w:pPr>
+        <w:ind w:left="1440" w:hanging="360"/>
+      </w:pPr>
+      <w:rPr>
+        <w:rFonts w:ascii="Courier New" w:hAnsi="Courier New" w:cs="Courier New" w:hint="default"/>
+      </w:rPr>
+    </w:lvl>
+    <w:lvl w:ilvl="2" w:tplc="40090005" w:tentative="1">
+      <w:start w:val="1"/>
+      <w:numFmt w:val="bullet"/>
+      <w:lvlText w:val=""/>
+      <w:lvlJc w:val="left"/>
+      <w:pPr>
+        <w:ind w:left="2160" w:hanging="360"/>
+      </w:pPr>
+      <w:rPr>
+        <w:rFonts w:ascii="Wingdings" w:hAnsi="Wingdings" w:hint="default"/>
+      </w:rPr>
+    </w:lvl>
+    <w:lvl w:ilvl="3" w:tplc="40090001" w:tentative="1">
+      <w:start w:val="1"/>
+      <w:numFmt w:val="bullet"/>
+      <w:lvlText w:val=""/>
+      <w:lvlJc w:val="left"/>
+      <w:pPr>
+        <w:ind w:left="2880" w:hanging="360"/>
+      </w:pPr>
+      <w:rPr>
+        <w:rFonts w:ascii="Symbol" w:hAnsi="Symbol" w:hint="default"/>
+      </w:rPr>
+    </w:lvl>
+    <w:lvl w:ilvl="4" w:tplc="40090003" w:tentative="1">
+      <w:start w:val="1"/>
+      <w:numFmt w:val="bullet"/>
+      <w:lvlText w:val="o"/>
+      <w:lvlJc w:val="left"/>
+      <w:pPr>
+        <w:ind w:left="3600" w:hanging="360"/>
+      </w:pPr>
+      <w:rPr>
+        <w:rFonts w:ascii="Courier New" w:hAnsi="Courier New" w:cs="Courier New" w:hint="default"/>
+      </w:rPr>
+    </w:lvl>
+    <w:lvl w:ilvl="5" w:tplc="40090005" w:tentative="1">
+      <w:start w:val="1"/>
+      <w:numFmt w:val="bullet"/>
+      <w:lvlText w:val=""/>
+      <w:lvlJc w:val="left"/>
+      <w:pPr>
+        <w:ind w:left="4320" w:hanging="360"/>
+      </w:pPr>
+      <w:rPr>
+        <w:rFonts w:ascii="Wingdings" w:hAnsi="Wingdings" w:hint="default"/>
+      </w:rPr>
+    </w:lvl>
+    <w:lvl w:ilvl="6" w:tplc="40090001" w:tentative="1">
+      <w:start w:val="1"/>
+      <w:numFmt w:val="bullet"/>
+      <w:lvlText w:val=""/>
+      <w:lvlJc w:val="left"/>
+      <w:pPr>
+        <w:ind w:left="5040" w:hanging="360"/>
+      </w:pPr>
+      <w:rPr>
+        <w:rFonts w:ascii="Symbol" w:hAnsi="Symbol" w:hint="default"/>
+      </w:rPr>
+    </w:lvl>
+    <w:lvl w:ilvl="7" w:tplc="40090003" w:tentative="1">
+      <w:start w:val="1"/>
+      <w:numFmt w:val="bullet"/>
+      <w:lvlText w:val="o"/>
+      <w:lvlJc w:val="left"/>
+      <w:pPr>
+        <w:ind w:left="5760" w:hanging="360"/>
+      </w:pPr>
+      <w:rPr>
+        <w:rFonts w:ascii="Courier New" w:hAnsi="Courier New" w:cs="Courier New" w:hint="default"/>
+      </w:rPr>
+    </w:lvl>
+    <w:lvl w:ilvl="8" w:tplc="40090005" w:tentative="1">
+      <w:start w:val="1"/>
+      <w:numFmt w:val="bullet"/>
+      <w:lvlText w:val=""/>
+      <w:lvlJc w:val="left"/>
+      <w:pPr>
+        <w:ind w:left="6480" w:hanging="360"/>
+      </w:pPr>
+      <w:rPr>
+        <w:rFonts w:ascii="Wingdings" w:hAnsi="Wingdings" w:hint="default"/>
+      </w:rPr>
+    </w:lvl>
+  </w:abstractNum>
+  <w:abstractNum w:abstractNumId="10" w15:restartNumberingAfterBreak="0">
+    <w:nsid w:val="680604DC"/>
+    <w:multiLevelType w:val="multilevel"/>
+    <w:tmpl w:val="11C4F8A4"/>
+    <w:lvl w:ilvl="0">
+      <w:start w:val="1"/>
+      <w:numFmt w:val="bullet"/>
+      <w:lvlText w:val=""/>
+      <w:lvlJc w:val="left"/>
+      <w:pPr>
+        <w:tabs>
+          <w:tab w:val="num" w:pos="720"/>
+        </w:tabs>
+        <w:ind w:left="720" w:hanging="360"/>
+      </w:pPr>
+      <w:rPr>
+        <w:rFonts w:ascii="Symbol" w:hAnsi="Symbol" w:hint="default"/>
+        <w:sz w:val="20"/>
+      </w:rPr>
+    </w:lvl>
+    <w:lvl w:ilvl="1" w:tentative="1">
+      <w:start w:val="1"/>
+      <w:numFmt w:val="bullet"/>
+      <w:lvlText w:val="o"/>
+      <w:lvlJc w:val="left"/>
+      <w:pPr>
+        <w:tabs>
+          <w:tab w:val="num" w:pos="1440"/>
+        </w:tabs>
+        <w:ind w:left="1440" w:hanging="360"/>
+      </w:pPr>
+      <w:rPr>
+        <w:rFonts w:ascii="Courier New" w:hAnsi="Courier New" w:hint="default"/>
+        <w:sz w:val="20"/>
+      </w:rPr>
+    </w:lvl>
+    <w:lvl w:ilvl="2" w:tentative="1">
+      <w:start w:val="1"/>
+      <w:numFmt w:val="bullet"/>
+      <w:lvlText w:val=""/>
+      <w:lvlJc w:val="left"/>
+      <w:pPr>
+        <w:tabs>
+          <w:tab w:val="num" w:pos="2160"/>
+        </w:tabs>
+        <w:ind w:left="2160" w:hanging="360"/>
+      </w:pPr>
+      <w:rPr>
+        <w:rFonts w:ascii="Wingdings" w:hAnsi="Wingdings" w:hint="default"/>
+        <w:sz w:val="20"/>
+      </w:rPr>
+    </w:lvl>
+    <w:lvl w:ilvl="3" w:tentative="1">
+      <w:start w:val="1"/>
+      <w:numFmt w:val="bullet"/>
+      <w:lvlText w:val=""/>
+      <w:lvlJc w:val="left"/>
+      <w:pPr>
+        <w:tabs>
+          <w:tab w:val="num" w:pos="2880"/>
+        </w:tabs>
+        <w:ind w:left="2880" w:hanging="360"/>
+      </w:pPr>
+      <w:rPr>
+        <w:rFonts w:ascii="Wingdings" w:hAnsi="Wingdings" w:hint="default"/>
+        <w:sz w:val="20"/>
+      </w:rPr>
+    </w:lvl>
+    <w:lvl w:ilvl="4" w:tentative="1">
+      <w:start w:val="1"/>
+      <w:numFmt w:val="bullet"/>
+      <w:lvlText w:val=""/>
+      <w:lvlJc w:val="left"/>
+      <w:pPr>
+        <w:tabs>
+          <w:tab w:val="num" w:pos="3600"/>
+        </w:tabs>
+        <w:ind w:left="3600" w:hanging="360"/>
+      </w:pPr>
+      <w:rPr>
+        <w:rFonts w:ascii="Wingdings" w:hAnsi="Wingdings" w:hint="default"/>
+        <w:sz w:val="20"/>
+      </w:rPr>
+    </w:lvl>
+    <w:lvl w:ilvl="5" w:tentative="1">
+      <w:start w:val="1"/>
+      <w:numFmt w:val="bullet"/>
+      <w:lvlText w:val=""/>
+      <w:lvlJc w:val="left"/>
+      <w:pPr>
+        <w:tabs>
+          <w:tab w:val="num" w:pos="4320"/>
+        </w:tabs>
+        <w:ind w:left="4320" w:hanging="360"/>
+      </w:pPr>
+      <w:rPr>
+        <w:rFonts w:ascii="Wingdings" w:hAnsi="Wingdings" w:hint="default"/>
+        <w:sz w:val="20"/>
+      </w:rPr>
+    </w:lvl>
+    <w:lvl w:ilvl="6" w:tentative="1">
+      <w:start w:val="1"/>
+      <w:numFmt w:val="bullet"/>
+      <w:lvlText w:val=""/>
+      <w:lvlJc w:val="left"/>
+      <w:pPr>
+        <w:tabs>
+          <w:tab w:val="num" w:pos="5040"/>
+        </w:tabs>
+        <w:ind w:left="5040" w:hanging="360"/>
+      </w:pPr>
+      <w:rPr>
+        <w:rFonts w:ascii="Wingdings" w:hAnsi="Wingdings" w:hint="default"/>
+        <w:sz w:val="20"/>
+      </w:rPr>
+    </w:lvl>
+    <w:lvl w:ilvl="7" w:tentative="1">
+      <w:start w:val="1"/>
+      <w:numFmt w:val="bullet"/>
+      <w:lvlText w:val=""/>
+      <w:lvlJc w:val="left"/>
+      <w:pPr>
+        <w:tabs>
+          <w:tab w:val="num" w:pos="5760"/>
+        </w:tabs>
+        <w:ind w:left="5760" w:hanging="360"/>
+      </w:pPr>
+      <w:rPr>
+        <w:rFonts w:ascii="Wingdings" w:hAnsi="Wingdings" w:hint="default"/>
+        <w:sz w:val="20"/>
+      </w:rPr>
+    </w:lvl>
+    <w:lvl w:ilvl="8" w:tentative="1">
+      <w:start w:val="1"/>
+      <w:numFmt w:val="bullet"/>
+      <w:lvlText w:val=""/>
+      <w:lvlJc w:val="left"/>
+      <w:pPr>
+        <w:tabs>
+          <w:tab w:val="num" w:pos="6480"/>
+        </w:tabs>
+        <w:ind w:left="6480" w:hanging="360"/>
+      </w:pPr>
+      <w:rPr>
+        <w:rFonts w:ascii="Wingdings" w:hAnsi="Wingdings" w:hint="default"/>
+        <w:sz w:val="20"/>
+      </w:rPr>
+    </w:lvl>
+  </w:abstractNum>
+  <w:abstractNum w:abstractNumId="11" w15:restartNumberingAfterBreak="0">
     <w:nsid w:val="6FD05C63"/>
     <w:multiLevelType w:val="hybridMultilevel"/>
     <w:tmpl w:val="87A44470"/>
@@ -1157,6 +2467,12 @@
     <w:abstractNumId w:val="0"/>
   </w:num>
   <w:num w:numId="10" w16cid:durableId="10956040">
+    <w:abstractNumId w:val="11"/>
+  </w:num>
+  <w:num w:numId="11" w16cid:durableId="713388181">
+    <w:abstractNumId w:val="10"/>
+  </w:num>
+  <w:num w:numId="12" w16cid:durableId="2115637529">
     <w:abstractNumId w:val="9"/>
   </w:num>
 </w:numbering>
@@ -1768,7 +3084,6 @@
   <w:style w:type="character" w:default="1" w:styleId="DefaultParagraphFont">
     <w:name w:val="Default Paragraph Font"/>
     <w:uiPriority w:val="1"/>
-    <w:semiHidden/>
     <w:unhideWhenUsed/>
   </w:style>
   <w:style w:type="table" w:default="1" w:styleId="TableNormal">
@@ -12544,6 +13859,443 @@
         <w:shd w:val="clear" w:color="auto" w:fill="FBCAA2" w:themeFill="accent6" w:themeFillTint="7F"/>
       </w:tcPr>
     </w:tblStylePr>
+  </w:style>
+  <w:style w:type="table" w:styleId="PlainTable1">
+    <w:name w:val="Plain Table 1"/>
+    <w:basedOn w:val="TableNormal"/>
+    <w:uiPriority w:val="99"/>
+    <w:rsid w:val="00DB380E"/>
+    <w:pPr>
+      <w:spacing w:after="0" w:line="240" w:lineRule="auto"/>
+    </w:pPr>
+    <w:tblPr>
+      <w:tblStyleRowBandSize w:val="1"/>
+      <w:tblStyleColBandSize w:val="1"/>
+      <w:tblBorders>
+        <w:top w:val="single" w:sz="4" w:space="0" w:color="BFBFBF" w:themeColor="background1" w:themeShade="BF"/>
+        <w:left w:val="single" w:sz="4" w:space="0" w:color="BFBFBF" w:themeColor="background1" w:themeShade="BF"/>
+        <w:bottom w:val="single" w:sz="4" w:space="0" w:color="BFBFBF" w:themeColor="background1" w:themeShade="BF"/>
+        <w:right w:val="single" w:sz="4" w:space="0" w:color="BFBFBF" w:themeColor="background1" w:themeShade="BF"/>
+        <w:insideH w:val="single" w:sz="4" w:space="0" w:color="BFBFBF" w:themeColor="background1" w:themeShade="BF"/>
+        <w:insideV w:val="single" w:sz="4" w:space="0" w:color="BFBFBF" w:themeColor="background1" w:themeShade="BF"/>
+      </w:tblBorders>
+    </w:tblPr>
+    <w:tblStylePr w:type="firstRow">
+      <w:rPr>
+        <w:b/>
+        <w:bCs/>
+      </w:rPr>
+    </w:tblStylePr>
+    <w:tblStylePr w:type="lastRow">
+      <w:rPr>
+        <w:b/>
+        <w:bCs/>
+      </w:rPr>
+      <w:tblPr/>
+      <w:tcPr>
+        <w:tcBorders>
+          <w:top w:val="double" w:sz="4" w:space="0" w:color="BFBFBF" w:themeColor="background1" w:themeShade="BF"/>
+        </w:tcBorders>
+      </w:tcPr>
+    </w:tblStylePr>
+    <w:tblStylePr w:type="firstCol">
+      <w:rPr>
+        <w:b/>
+        <w:bCs/>
+      </w:rPr>
+    </w:tblStylePr>
+    <w:tblStylePr w:type="lastCol">
+      <w:rPr>
+        <w:b/>
+        <w:bCs/>
+      </w:rPr>
+    </w:tblStylePr>
+    <w:tblStylePr w:type="band1Vert">
+      <w:tblPr/>
+      <w:tcPr>
+        <w:shd w:val="clear" w:color="auto" w:fill="F2F2F2" w:themeFill="background1" w:themeFillShade="F2"/>
+      </w:tcPr>
+    </w:tblStylePr>
+    <w:tblStylePr w:type="band1Horz">
+      <w:tblPr/>
+      <w:tcPr>
+        <w:shd w:val="clear" w:color="auto" w:fill="F2F2F2" w:themeFill="background1" w:themeFillShade="F2"/>
+      </w:tcPr>
+    </w:tblStylePr>
+  </w:style>
+  <w:style w:type="table" w:styleId="PlainTable2">
+    <w:name w:val="Plain Table 2"/>
+    <w:basedOn w:val="TableNormal"/>
+    <w:uiPriority w:val="99"/>
+    <w:rsid w:val="00DB380E"/>
+    <w:pPr>
+      <w:spacing w:after="0" w:line="240" w:lineRule="auto"/>
+    </w:pPr>
+    <w:tblPr>
+      <w:tblStyleRowBandSize w:val="1"/>
+      <w:tblStyleColBandSize w:val="1"/>
+      <w:tblBorders>
+        <w:top w:val="single" w:sz="4" w:space="0" w:color="7F7F7F" w:themeColor="text1" w:themeTint="80"/>
+        <w:bottom w:val="single" w:sz="4" w:space="0" w:color="7F7F7F" w:themeColor="text1" w:themeTint="80"/>
+      </w:tblBorders>
+    </w:tblPr>
+    <w:tblStylePr w:type="firstRow">
+      <w:rPr>
+        <w:b/>
+        <w:bCs/>
+      </w:rPr>
+      <w:tblPr/>
+      <w:tcPr>
+        <w:tcBorders>
+          <w:bottom w:val="single" w:sz="4" w:space="0" w:color="7F7F7F" w:themeColor="text1" w:themeTint="80"/>
+        </w:tcBorders>
+      </w:tcPr>
+    </w:tblStylePr>
+    <w:tblStylePr w:type="lastRow">
+      <w:rPr>
+        <w:b/>
+        <w:bCs/>
+      </w:rPr>
+      <w:tblPr/>
+      <w:tcPr>
+        <w:tcBorders>
+          <w:top w:val="single" w:sz="4" w:space="0" w:color="7F7F7F" w:themeColor="text1" w:themeTint="80"/>
+        </w:tcBorders>
+      </w:tcPr>
+    </w:tblStylePr>
+    <w:tblStylePr w:type="firstCol">
+      <w:rPr>
+        <w:b/>
+        <w:bCs/>
+      </w:rPr>
+    </w:tblStylePr>
+    <w:tblStylePr w:type="lastCol">
+      <w:rPr>
+        <w:b/>
+        <w:bCs/>
+      </w:rPr>
+    </w:tblStylePr>
+    <w:tblStylePr w:type="band1Vert">
+      <w:tblPr/>
+      <w:tcPr>
+        <w:tcBorders>
+          <w:left w:val="single" w:sz="4" w:space="0" w:color="7F7F7F" w:themeColor="text1" w:themeTint="80"/>
+          <w:right w:val="single" w:sz="4" w:space="0" w:color="7F7F7F" w:themeColor="text1" w:themeTint="80"/>
+        </w:tcBorders>
+      </w:tcPr>
+    </w:tblStylePr>
+    <w:tblStylePr w:type="band2Vert">
+      <w:tblPr/>
+      <w:tcPr>
+        <w:tcBorders>
+          <w:left w:val="single" w:sz="4" w:space="0" w:color="7F7F7F" w:themeColor="text1" w:themeTint="80"/>
+          <w:right w:val="single" w:sz="4" w:space="0" w:color="7F7F7F" w:themeColor="text1" w:themeTint="80"/>
+        </w:tcBorders>
+      </w:tcPr>
+    </w:tblStylePr>
+    <w:tblStylePr w:type="band1Horz">
+      <w:tblPr/>
+      <w:tcPr>
+        <w:tcBorders>
+          <w:top w:val="single" w:sz="4" w:space="0" w:color="7F7F7F" w:themeColor="text1" w:themeTint="80"/>
+          <w:bottom w:val="single" w:sz="4" w:space="0" w:color="7F7F7F" w:themeColor="text1" w:themeTint="80"/>
+        </w:tcBorders>
+      </w:tcPr>
+    </w:tblStylePr>
+  </w:style>
+  <w:style w:type="table" w:styleId="PlainTable3">
+    <w:name w:val="Plain Table 3"/>
+    <w:basedOn w:val="TableNormal"/>
+    <w:uiPriority w:val="99"/>
+    <w:rsid w:val="00DB380E"/>
+    <w:pPr>
+      <w:spacing w:after="0" w:line="240" w:lineRule="auto"/>
+    </w:pPr>
+    <w:tblPr>
+      <w:tblStyleRowBandSize w:val="1"/>
+      <w:tblStyleColBandSize w:val="1"/>
+    </w:tblPr>
+    <w:tblStylePr w:type="firstRow">
+      <w:rPr>
+        <w:b/>
+        <w:bCs/>
+        <w:caps/>
+      </w:rPr>
+      <w:tblPr/>
+      <w:tcPr>
+        <w:tcBorders>
+          <w:bottom w:val="single" w:sz="4" w:space="0" w:color="7F7F7F" w:themeColor="text1" w:themeTint="80"/>
+        </w:tcBorders>
+      </w:tcPr>
+    </w:tblStylePr>
+    <w:tblStylePr w:type="lastRow">
+      <w:rPr>
+        <w:b/>
+        <w:bCs/>
+        <w:caps/>
+      </w:rPr>
+      <w:tblPr/>
+      <w:tcPr>
+        <w:tcBorders>
+          <w:top w:val="nil"/>
+        </w:tcBorders>
+      </w:tcPr>
+    </w:tblStylePr>
+    <w:tblStylePr w:type="firstCol">
+      <w:rPr>
+        <w:b/>
+        <w:bCs/>
+        <w:caps/>
+      </w:rPr>
+      <w:tblPr/>
+      <w:tcPr>
+        <w:tcBorders>
+          <w:right w:val="single" w:sz="4" w:space="0" w:color="7F7F7F" w:themeColor="text1" w:themeTint="80"/>
+        </w:tcBorders>
+      </w:tcPr>
+    </w:tblStylePr>
+    <w:tblStylePr w:type="lastCol">
+      <w:rPr>
+        <w:b/>
+        <w:bCs/>
+        <w:caps/>
+      </w:rPr>
+      <w:tblPr/>
+      <w:tcPr>
+        <w:tcBorders>
+          <w:left w:val="nil"/>
+        </w:tcBorders>
+      </w:tcPr>
+    </w:tblStylePr>
+    <w:tblStylePr w:type="band1Vert">
+      <w:tblPr/>
+      <w:tcPr>
+        <w:shd w:val="clear" w:color="auto" w:fill="F2F2F2" w:themeFill="background1" w:themeFillShade="F2"/>
+      </w:tcPr>
+    </w:tblStylePr>
+    <w:tblStylePr w:type="band1Horz">
+      <w:tblPr/>
+      <w:tcPr>
+        <w:shd w:val="clear" w:color="auto" w:fill="F2F2F2" w:themeFill="background1" w:themeFillShade="F2"/>
+      </w:tcPr>
+    </w:tblStylePr>
+    <w:tblStylePr w:type="neCell">
+      <w:tblPr/>
+      <w:tcPr>
+        <w:tcBorders>
+          <w:left w:val="nil"/>
+        </w:tcBorders>
+      </w:tcPr>
+    </w:tblStylePr>
+    <w:tblStylePr w:type="nwCell">
+      <w:tblPr/>
+      <w:tcPr>
+        <w:tcBorders>
+          <w:right w:val="nil"/>
+        </w:tcBorders>
+      </w:tcPr>
+    </w:tblStylePr>
+  </w:style>
+  <w:style w:type="table" w:styleId="PlainTable4">
+    <w:name w:val="Plain Table 4"/>
+    <w:basedOn w:val="TableNormal"/>
+    <w:uiPriority w:val="99"/>
+    <w:rsid w:val="00DB380E"/>
+    <w:pPr>
+      <w:spacing w:after="0" w:line="240" w:lineRule="auto"/>
+    </w:pPr>
+    <w:tblPr>
+      <w:tblStyleRowBandSize w:val="1"/>
+      <w:tblStyleColBandSize w:val="1"/>
+    </w:tblPr>
+    <w:tblStylePr w:type="firstRow">
+      <w:rPr>
+        <w:b/>
+        <w:bCs/>
+      </w:rPr>
+    </w:tblStylePr>
+    <w:tblStylePr w:type="lastRow">
+      <w:rPr>
+        <w:b/>
+        <w:bCs/>
+      </w:rPr>
+    </w:tblStylePr>
+    <w:tblStylePr w:type="firstCol">
+      <w:rPr>
+        <w:b/>
+        <w:bCs/>
+      </w:rPr>
+    </w:tblStylePr>
+    <w:tblStylePr w:type="lastCol">
+      <w:rPr>
+        <w:b/>
+        <w:bCs/>
+      </w:rPr>
+    </w:tblStylePr>
+    <w:tblStylePr w:type="band1Vert">
+      <w:tblPr/>
+      <w:tcPr>
+        <w:shd w:val="clear" w:color="auto" w:fill="F2F2F2" w:themeFill="background1" w:themeFillShade="F2"/>
+      </w:tcPr>
+    </w:tblStylePr>
+    <w:tblStylePr w:type="band1Horz">
+      <w:tblPr/>
+      <w:tcPr>
+        <w:shd w:val="clear" w:color="auto" w:fill="F2F2F2" w:themeFill="background1" w:themeFillShade="F2"/>
+      </w:tcPr>
+    </w:tblStylePr>
+  </w:style>
+  <w:style w:type="table" w:styleId="PlainTable5">
+    <w:name w:val="Plain Table 5"/>
+    <w:basedOn w:val="TableNormal"/>
+    <w:uiPriority w:val="99"/>
+    <w:rsid w:val="00DB380E"/>
+    <w:pPr>
+      <w:spacing w:after="0" w:line="240" w:lineRule="auto"/>
+    </w:pPr>
+    <w:tblPr>
+      <w:tblStyleRowBandSize w:val="1"/>
+      <w:tblStyleColBandSize w:val="1"/>
+    </w:tblPr>
+    <w:tblStylePr w:type="firstRow">
+      <w:rPr>
+        <w:rFonts w:asciiTheme="majorHAnsi" w:eastAsiaTheme="majorEastAsia" w:hAnsiTheme="majorHAnsi" w:cstheme="majorBidi"/>
+        <w:i/>
+        <w:iCs/>
+        <w:sz w:val="26"/>
+      </w:rPr>
+      <w:tblPr/>
+      <w:tcPr>
+        <w:tcBorders>
+          <w:bottom w:val="single" w:sz="4" w:space="0" w:color="7F7F7F" w:themeColor="text1" w:themeTint="80"/>
+        </w:tcBorders>
+        <w:shd w:val="clear" w:color="auto" w:fill="FFFFFF" w:themeFill="background1"/>
+      </w:tcPr>
+    </w:tblStylePr>
+    <w:tblStylePr w:type="lastRow">
+      <w:rPr>
+        <w:rFonts w:asciiTheme="majorHAnsi" w:eastAsiaTheme="majorEastAsia" w:hAnsiTheme="majorHAnsi" w:cstheme="majorBidi"/>
+        <w:i/>
+        <w:iCs/>
+        <w:sz w:val="26"/>
+      </w:rPr>
+      <w:tblPr/>
+      <w:tcPr>
+        <w:tcBorders>
+          <w:top w:val="single" w:sz="4" w:space="0" w:color="7F7F7F" w:themeColor="text1" w:themeTint="80"/>
+        </w:tcBorders>
+        <w:shd w:val="clear" w:color="auto" w:fill="FFFFFF" w:themeFill="background1"/>
+      </w:tcPr>
+    </w:tblStylePr>
+    <w:tblStylePr w:type="firstCol">
+      <w:pPr>
+        <w:jc w:val="right"/>
+      </w:pPr>
+      <w:rPr>
+        <w:rFonts w:asciiTheme="majorHAnsi" w:eastAsiaTheme="majorEastAsia" w:hAnsiTheme="majorHAnsi" w:cstheme="majorBidi"/>
+        <w:i/>
+        <w:iCs/>
+        <w:sz w:val="26"/>
+      </w:rPr>
+      <w:tblPr/>
+      <w:tcPr>
+        <w:tcBorders>
+          <w:right w:val="single" w:sz="4" w:space="0" w:color="7F7F7F" w:themeColor="text1" w:themeTint="80"/>
+        </w:tcBorders>
+        <w:shd w:val="clear" w:color="auto" w:fill="FFFFFF" w:themeFill="background1"/>
+      </w:tcPr>
+    </w:tblStylePr>
+    <w:tblStylePr w:type="lastCol">
+      <w:rPr>
+        <w:rFonts w:asciiTheme="majorHAnsi" w:eastAsiaTheme="majorEastAsia" w:hAnsiTheme="majorHAnsi" w:cstheme="majorBidi"/>
+        <w:i/>
+        <w:iCs/>
+        <w:sz w:val="26"/>
+      </w:rPr>
+      <w:tblPr/>
+      <w:tcPr>
+        <w:tcBorders>
+          <w:left w:val="single" w:sz="4" w:space="0" w:color="7F7F7F" w:themeColor="text1" w:themeTint="80"/>
+        </w:tcBorders>
+        <w:shd w:val="clear" w:color="auto" w:fill="FFFFFF" w:themeFill="background1"/>
+      </w:tcPr>
+    </w:tblStylePr>
+    <w:tblStylePr w:type="band1Vert">
+      <w:tblPr/>
+      <w:tcPr>
+        <w:shd w:val="clear" w:color="auto" w:fill="F2F2F2" w:themeFill="background1" w:themeFillShade="F2"/>
+      </w:tcPr>
+    </w:tblStylePr>
+    <w:tblStylePr w:type="band1Horz">
+      <w:tblPr/>
+      <w:tcPr>
+        <w:shd w:val="clear" w:color="auto" w:fill="F2F2F2" w:themeFill="background1" w:themeFillShade="F2"/>
+      </w:tcPr>
+    </w:tblStylePr>
+    <w:tblStylePr w:type="neCell">
+      <w:tblPr/>
+      <w:tcPr>
+        <w:tcBorders>
+          <w:left w:val="nil"/>
+        </w:tcBorders>
+      </w:tcPr>
+    </w:tblStylePr>
+    <w:tblStylePr w:type="nwCell">
+      <w:tblPr/>
+      <w:tcPr>
+        <w:tcBorders>
+          <w:right w:val="nil"/>
+        </w:tcBorders>
+      </w:tcPr>
+    </w:tblStylePr>
+    <w:tblStylePr w:type="seCell">
+      <w:tblPr/>
+      <w:tcPr>
+        <w:tcBorders>
+          <w:left w:val="nil"/>
+        </w:tcBorders>
+      </w:tcPr>
+    </w:tblStylePr>
+    <w:tblStylePr w:type="swCell">
+      <w:tblPr/>
+      <w:tcPr>
+        <w:tcBorders>
+          <w:right w:val="nil"/>
+        </w:tcBorders>
+      </w:tcPr>
+    </w:tblStylePr>
+  </w:style>
+  <w:style w:type="table" w:styleId="TableGridLight">
+    <w:name w:val="Grid Table Light"/>
+    <w:basedOn w:val="TableNormal"/>
+    <w:uiPriority w:val="99"/>
+    <w:rsid w:val="00DB380E"/>
+    <w:pPr>
+      <w:spacing w:after="0" w:line="240" w:lineRule="auto"/>
+    </w:pPr>
+    <w:tblPr>
+      <w:tblBorders>
+        <w:top w:val="single" w:sz="4" w:space="0" w:color="BFBFBF" w:themeColor="background1" w:themeShade="BF"/>
+        <w:left w:val="single" w:sz="4" w:space="0" w:color="BFBFBF" w:themeColor="background1" w:themeShade="BF"/>
+        <w:bottom w:val="single" w:sz="4" w:space="0" w:color="BFBFBF" w:themeColor="background1" w:themeShade="BF"/>
+        <w:right w:val="single" w:sz="4" w:space="0" w:color="BFBFBF" w:themeColor="background1" w:themeShade="BF"/>
+        <w:insideH w:val="single" w:sz="4" w:space="0" w:color="BFBFBF" w:themeColor="background1" w:themeShade="BF"/>
+        <w:insideV w:val="single" w:sz="4" w:space="0" w:color="BFBFBF" w:themeColor="background1" w:themeShade="BF"/>
+      </w:tblBorders>
+    </w:tblPr>
+  </w:style>
+  <w:style w:type="character" w:styleId="HTMLCode">
+    <w:name w:val="HTML Code"/>
+    <w:basedOn w:val="DefaultParagraphFont"/>
+    <w:uiPriority w:val="99"/>
+    <w:semiHidden/>
+    <w:unhideWhenUsed/>
+    <w:rsid w:val="007E7A8D"/>
+    <w:rPr>
+      <w:rFonts w:ascii="Courier New" w:eastAsia="Times New Roman" w:hAnsi="Courier New" w:cs="Courier New"/>
+      <w:sz w:val="20"/>
+      <w:szCs w:val="20"/>
+    </w:rPr>
   </w:style>
 </w:styles>
 </file>

</xml_diff>